<commit_message>
Fix KYC form exports and internal review
</commit_message>
<xml_diff>
--- a/backend/templates/kyc-part-1-template.docx
+++ b/backend/templates/kyc-part-1-template.docx
@@ -7813,7 +7813,7 @@
         </w:rPr>
       </w:pPr>
       <w:r>
-        <w:t>{dualCitizenshipDetails}</w:t>
+        <w:t>{dualCitizenshipDetails} | Passport copy: {dualCitizenshipPassportFileName}</w:t>
       </w:r>
     </w:p>
     <w:p>
@@ -7931,7 +7931,7 @@
                 <w:spacing w:val="-10"/>
                 <w:sz w:val="18"/>
               </w:rPr>
-              <w:t>1</w:t>
+              <w:t>Full name</w:t>
             </w:r>
           </w:p>
         </w:tc>
@@ -7983,7 +7983,7 @@
                 <w:spacing w:val="-10"/>
                 <w:sz w:val="18"/>
               </w:rPr>
-              <w:t>2</w:t>
+              <w:t>Position / Job title</w:t>
             </w:r>
           </w:p>
         </w:tc>
@@ -8035,7 +8035,7 @@
                 <w:spacing w:val="-10"/>
                 <w:sz w:val="18"/>
               </w:rPr>
-              <w:t>3</w:t>
+              <w:t>Nationality</w:t>
             </w:r>
           </w:p>
         </w:tc>
@@ -8087,7 +8087,7 @@
                 <w:spacing w:val="-10"/>
                 <w:sz w:val="18"/>
               </w:rPr>
-              <w:t>4</w:t>
+              <w:t>QID / Passport Number</w:t>
             </w:r>
           </w:p>
         </w:tc>
@@ -8139,7 +8139,7 @@
                 <w:spacing w:val="-10"/>
                 <w:sz w:val="18"/>
               </w:rPr>
-              <w:t>5</w:t>
+              <w:t>Mobile Number</w:t>
             </w:r>
           </w:p>
         </w:tc>
@@ -8191,7 +8191,7 @@
                 <w:spacing w:val="-10"/>
                 <w:sz w:val="18"/>
               </w:rPr>
-              <w:t>6</w:t>
+              <w:t>Email</w:t>
             </w:r>
           </w:p>
         </w:tc>
@@ -9108,7 +9108,7 @@
                 <w:spacing w:val="-4"/>
                 <w:sz w:val="18"/>
               </w:rPr>
-              <w:t>Name:</w:t>
+              <w:t>AML Supervisor Name:</w:t>
             </w:r>
           </w:p>
         </w:tc>
@@ -9145,7 +9145,7 @@
                 <w:spacing w:val="-2"/>
                 <w:sz w:val="18"/>
               </w:rPr>
-              <w:t>Signature:</w:t>
+              <w:t>AML Supervisor signature:</w:t>
             </w:r>
           </w:p>
         </w:tc>

</xml_diff>

<commit_message>
Refine KYC document labels and template notes
</commit_message>
<xml_diff>
--- a/backend/templates/kyc-part-1-template.docx
+++ b/backend/templates/kyc-part-1-template.docx
@@ -8500,6 +8500,54 @@
       </w:pPr>
       <w:r>
         <w:t>{docTaxCard}  Tax Card of the concern entity.</w:t>
+      </w:r>
+    </w:p>
+    <w:p>
+      <w:pPr>
+        <w:pStyle w:val="BodyText"/>
+        <w:spacing w:before="180"/>
+      </w:pPr>
+      <w:r>
+        <w:rPr>
+          <w:b/>
+          <w:sz w:val="18"/>
+        </w:rPr>
+        <w:t>Additional documents:</w:t>
+      </w:r>
+    </w:p>
+    <w:p>
+      <w:pPr>
+        <w:pStyle w:val="BodyText"/>
+      </w:pPr>
+      <w:r>
+        <w:rPr>
+          <w:sz w:val="18"/>
+        </w:rPr>
+        <w:t>{additionalDocumentsText}</w:t>
+      </w:r>
+    </w:p>
+    <w:p>
+      <w:pPr>
+        <w:pStyle w:val="BodyText"/>
+        <w:spacing w:before="120"/>
+      </w:pPr>
+      <w:r>
+        <w:rPr>
+          <w:b/>
+          <w:sz w:val="18"/>
+        </w:rPr>
+        <w:t>Additional notes for KYC preparation documents:</w:t>
+      </w:r>
+    </w:p>
+    <w:p>
+      <w:pPr>
+        <w:pStyle w:val="BodyText"/>
+      </w:pPr>
+      <w:r>
+        <w:rPr>
+          <w:sz w:val="18"/>
+        </w:rPr>
+        <w:t>{uploadedFilesNote}</w:t>
       </w:r>
     </w:p>
     <w:p>

</xml_diff>